<commit_message>
Add a color-coded Severity column to the OETC line report
Section 5 (Thermal Inspection Measurements) now has a new "Severity"
column right after ΔT (°C), shaded green/yellow/orange/red per the
customer's own classification (Normal <=5C, Low >5-10C, Medium
>10-20C, High/Critical >20C) so a reviewer can spot which insulators
need a maintenance team dispatched at a glance. The color is computed
server-side from the reading and written into the table cell's shading
attribute directly in the docx template's XML (docxtpl renders Jinja
over the whole document, so a {{ }} tag works there same as in visible
text) — the existing text "Severity" column (the inspector's own
manual classification) is untouched.

Co-Authored-By: Claude Sonnet 5 <noreply@anthropic.com>
</commit_message>
<xml_diff>
--- a/backend/app/templates/oetc_line_report.docx
+++ b/backend/app/templates/oetc_line_report.docx
@@ -123,7 +123,6 @@
             <w:r>
               <w:t>Line ID: {{ line_id }}</w:t>
             </w:r>
-            <w:r/>
           </w:p>
         </w:tc>
       </w:tr>
@@ -142,7 +141,6 @@
             <w:r>
               <w:t>Date: {{ report_date }}</w:t>
             </w:r>
-            <w:r/>
           </w:p>
         </w:tc>
       </w:tr>
@@ -161,9 +159,6 @@
             <w:r>
               <w:t>Report number: {{ report_number }}</w:t>
             </w:r>
-            <w:r/>
-            <w:r/>
-            <w:r/>
             <w:r>
               <w:rPr>
                 <w:color w:val="EE0000"/>
@@ -643,14 +638,7 @@
                 <w:b/>
                 <w:sz w:val="16"/>
               </w:rPr>
-              <w:t xml:space="preserve">Ambient </w:t>
-            </w:r>
-            <w:r>
-              <w:rPr>
-                <w:b/>
-                <w:sz w:val="16"/>
-              </w:rPr>
-              <w:t>Temperature</w:t>
+              <w:t xml:space="preserve">Ambient Temperature</w:t>
             </w:r>
             <w:r>
               <w:t xml:space="preserve"> </w:t>
@@ -781,10 +769,7 @@
               <w:t xml:space="preserve"> </w:t>
             </w:r>
             <w:r>
-              <w:t>Day</w:t>
-            </w:r>
-            <w:r>
-              <w:t xml:space="preserve">        </w:t>
+              <w:t xml:space="preserve">Day        </w:t>
             </w:r>
             <w:sdt>
               <w:sdtPr>
@@ -981,47 +966,7 @@
               <w:rPr>
                 <w:sz w:val="16"/>
               </w:rPr>
-              <w:t xml:space="preserve">         </w:t>
-            </w:r>
-            <w:proofErr w:type="gramStart"/>
-            <w:r>
-              <w:rPr>
-                <w:sz w:val="16"/>
-              </w:rPr>
-              <w:t xml:space="preserve">   </w:t>
-            </w:r>
-            <w:r>
-              <w:rPr>
-                <w:sz w:val="16"/>
-              </w:rPr>
-              <w:t>(</w:t>
-            </w:r>
-            <w:proofErr w:type="gramEnd"/>
-            <w:r>
-              <w:rPr>
-                <w:sz w:val="16"/>
-              </w:rPr>
-              <w:t>Δ</w:t>
-            </w:r>
-            <w:proofErr w:type="gramStart"/>
-            <w:r>
-              <w:rPr>
-                <w:sz w:val="16"/>
-              </w:rPr>
-              <w:t>T)</w:t>
-            </w:r>
-            <w:r>
-              <w:rPr>
-                <w:sz w:val="16"/>
-              </w:rPr>
-              <w:t xml:space="preserve">   </w:t>
-            </w:r>
-            <w:proofErr w:type="gramEnd"/>
-            <w:r>
-              <w:rPr>
-                <w:sz w:val="16"/>
-              </w:rPr>
-              <w:t>≤ 5°C</w:t>
+              <w:t xml:space="preserve">            (ΔT)   ≤ 5°C</w:t>
             </w:r>
           </w:p>
         </w:tc>
@@ -1087,41 +1032,7 @@
               <w:rPr>
                 <w:sz w:val="16"/>
               </w:rPr>
-              <w:t xml:space="preserve">             </w:t>
-            </w:r>
-            <w:proofErr w:type="gramStart"/>
-            <w:r>
-              <w:rPr>
-                <w:sz w:val="16"/>
-              </w:rPr>
-              <w:t xml:space="preserve">   (</w:t>
-            </w:r>
-            <w:proofErr w:type="gramEnd"/>
-            <w:r>
-              <w:rPr>
-                <w:sz w:val="16"/>
-              </w:rPr>
-              <w:t>Δ</w:t>
-            </w:r>
-            <w:proofErr w:type="gramStart"/>
-            <w:r>
-              <w:rPr>
-                <w:sz w:val="16"/>
-              </w:rPr>
-              <w:t>T)</w:t>
-            </w:r>
-            <w:r>
-              <w:rPr>
-                <w:sz w:val="16"/>
-              </w:rPr>
-              <w:t xml:space="preserve">   </w:t>
-            </w:r>
-            <w:proofErr w:type="gramEnd"/>
-            <w:r>
-              <w:rPr>
-                <w:sz w:val="16"/>
-              </w:rPr>
-              <w:t>&gt; 5°C to 10°C</w:t>
+              <w:t xml:space="preserve">                (ΔT)   &gt; 5°C to 10°C</w:t>
             </w:r>
           </w:p>
         </w:tc>
@@ -1179,47 +1090,7 @@
               <w:rPr>
                 <w:sz w:val="16"/>
               </w:rPr>
-              <w:t xml:space="preserve">Medium         </w:t>
-            </w:r>
-            <w:proofErr w:type="gramStart"/>
-            <w:r>
-              <w:rPr>
-                <w:sz w:val="16"/>
-              </w:rPr>
-              <w:t xml:space="preserve">   (</w:t>
-            </w:r>
-            <w:proofErr w:type="gramEnd"/>
-            <w:r>
-              <w:rPr>
-                <w:sz w:val="16"/>
-              </w:rPr>
-              <w:t>Δ</w:t>
-            </w:r>
-            <w:proofErr w:type="gramStart"/>
-            <w:r>
-              <w:rPr>
-                <w:sz w:val="16"/>
-              </w:rPr>
-              <w:t>T)</w:t>
-            </w:r>
-            <w:r>
-              <w:rPr>
-                <w:sz w:val="16"/>
-              </w:rPr>
-              <w:t xml:space="preserve">  </w:t>
-            </w:r>
-            <w:r>
-              <w:rPr>
-                <w:sz w:val="16"/>
-              </w:rPr>
-              <w:t>&gt;</w:t>
-            </w:r>
-            <w:proofErr w:type="gramEnd"/>
-            <w:r>
-              <w:rPr>
-                <w:sz w:val="16"/>
-              </w:rPr>
-              <w:t xml:space="preserve"> 10°C to 20°C</w:t>
+              <w:t xml:space="preserve">Medium            (ΔT)  &gt; 10°C to 20°C</w:t>
             </w:r>
           </w:p>
         </w:tc>
@@ -1279,41 +1150,13 @@
                 <w:bCs/>
                 <w:sz w:val="16"/>
               </w:rPr>
-              <w:t xml:space="preserve">High / </w:t>
-            </w:r>
-            <w:proofErr w:type="gramStart"/>
-            <w:r>
-              <w:rPr>
-                <w:b/>
-                <w:bCs/>
-                <w:sz w:val="16"/>
-              </w:rPr>
-              <w:t>Critical</w:t>
+              <w:t xml:space="preserve">High / Critical</w:t>
             </w:r>
             <w:r>
               <w:rPr>
                 <w:sz w:val="16"/>
               </w:rPr>
-              <w:t xml:space="preserve">  (</w:t>
-            </w:r>
-            <w:proofErr w:type="gramEnd"/>
-            <w:r>
-              <w:rPr>
-                <w:sz w:val="16"/>
-              </w:rPr>
-              <w:t>ΔT)</w:t>
-            </w:r>
-            <w:r>
-              <w:rPr>
-                <w:sz w:val="16"/>
-              </w:rPr>
-              <w:t xml:space="preserve"> </w:t>
-            </w:r>
-            <w:r>
-              <w:rPr>
-                <w:sz w:val="16"/>
-              </w:rPr>
-              <w:t>&gt; 20°C</w:t>
+              <w:t xml:space="preserve">  (ΔT) &gt; 20°C</w:t>
             </w:r>
           </w:p>
         </w:tc>
@@ -1474,21 +1317,7 @@
           <w:sz w:val="26"/>
         </w:rPr>
         <w:lastRenderedPageBreak/>
-        <w:t>4.</w:t>
-      </w:r>
-      <w:r>
-        <w:rPr>
-          <w:b/>
-          <w:sz w:val="26"/>
-        </w:rPr>
-        <w:t xml:space="preserve"> </w:t>
-      </w:r>
-      <w:r>
-        <w:rPr>
-          <w:b/>
-          <w:sz w:val="26"/>
-        </w:rPr>
-        <w:t>Inspection findings</w:t>
+        <w:t xml:space="preserve">4. Inspection findings</w:t>
       </w:r>
     </w:p>
     <w:p>
@@ -1594,14 +1423,7 @@
                 <w:b/>
                 <w:sz w:val="16"/>
               </w:rPr>
-              <w:t xml:space="preserve">Tower </w:t>
-            </w:r>
-            <w:r>
-              <w:rPr>
-                <w:b/>
-                <w:sz w:val="16"/>
-              </w:rPr>
-              <w:t>No.</w:t>
+              <w:t xml:space="preserve">Tower No.</w:t>
             </w:r>
           </w:p>
         </w:tc>
@@ -1934,21 +1756,7 @@
               <w:rPr>
                 <w:sz w:val="16"/>
               </w:rPr>
-              <w:t xml:space="preserve">If tension </w:t>
-            </w:r>
-            <w:proofErr w:type="gramStart"/>
-            <w:r>
-              <w:rPr>
-                <w:sz w:val="16"/>
-              </w:rPr>
-              <w:t xml:space="preserve">(  </w:t>
-            </w:r>
-            <w:proofErr w:type="gramEnd"/>
-            <w:r>
-              <w:rPr>
-                <w:sz w:val="16"/>
-              </w:rPr>
-              <w:t>{{ f.gs_side }} GS side)</w:t>
+              <w:t xml:space="preserve">If tension (  {{ f.gs_side }} GS side)</w:t>
             </w:r>
           </w:p>
         </w:tc>
@@ -2265,15 +2073,7 @@
                 <w:sz w:val="20"/>
                 <w:szCs w:val="16"/>
               </w:rPr>
-              <w:t>Image</w:t>
-            </w:r>
-            <w:r>
-              <w:rPr>
-                <w:b/>
-                <w:sz w:val="20"/>
-                <w:szCs w:val="16"/>
-              </w:rPr>
-              <w:t xml:space="preserve"> (Thermal / Visual)</w:t>
+              <w:t xml:space="preserve">Image (Thermal / Visual)</w:t>
             </w:r>
           </w:p>
         </w:tc>
@@ -2448,14 +2248,7 @@
                 <w:b/>
                 <w:sz w:val="16"/>
               </w:rPr>
-              <w:t>Pollution Condition</w:t>
-            </w:r>
-            <w:r>
-              <w:rPr>
-                <w:b/>
-                <w:sz w:val="16"/>
-              </w:rPr>
-              <w:t xml:space="preserve">: </w:t>
+              <w:t xml:space="preserve">Pollution Condition: </w:t>
             </w:r>
             <w:sdt>
               <w:sdtPr>
@@ -2610,19 +2403,7 @@
               <w:rPr>
                 <w:sz w:val="16"/>
               </w:rPr>
-              <w:t xml:space="preserve"> </w:t>
-            </w:r>
-            <w:r>
-              <w:rPr>
-                <w:sz w:val="16"/>
-              </w:rPr>
-              <w:t>Hotspot</w:t>
-            </w:r>
-            <w:r>
-              <w:rPr>
-                <w:sz w:val="16"/>
-              </w:rPr>
-              <w:t xml:space="preserve"> / </w:t>
+              <w:t xml:space="preserve"> Hotspot / </w:t>
             </w:r>
             <w:sdt>
               <w:sdtPr>
@@ -2650,19 +2431,7 @@
               <w:rPr>
                 <w:sz w:val="16"/>
               </w:rPr>
-              <w:t xml:space="preserve"> </w:t>
-            </w:r>
-            <w:r>
-              <w:rPr>
-                <w:sz w:val="16"/>
-              </w:rPr>
-              <w:t>Dry band</w:t>
-            </w:r>
-            <w:r>
-              <w:rPr>
-                <w:sz w:val="16"/>
-              </w:rPr>
-              <w:t xml:space="preserve"> / </w:t>
+              <w:t xml:space="preserve"> Dry band / </w:t>
             </w:r>
             <w:sdt>
               <w:sdtPr>
@@ -2690,19 +2459,7 @@
               <w:rPr>
                 <w:sz w:val="16"/>
               </w:rPr>
-              <w:t xml:space="preserve"> </w:t>
-            </w:r>
-            <w:r>
-              <w:rPr>
-                <w:sz w:val="16"/>
-              </w:rPr>
-              <w:t>Discharge track</w:t>
-            </w:r>
-            <w:r>
-              <w:rPr>
-                <w:sz w:val="16"/>
-              </w:rPr>
-              <w:t xml:space="preserve"> </w:t>
+              <w:t xml:space="preserve"> Discharge track </w:t>
             </w:r>
           </w:p>
           <w:p>
@@ -2717,14 +2474,7 @@
                 <w:b/>
                 <w:sz w:val="16"/>
               </w:rPr>
-              <w:t>Visual</w:t>
-            </w:r>
-            <w:r>
-              <w:rPr>
-                <w:b/>
-                <w:sz w:val="16"/>
-              </w:rPr>
-              <w:t xml:space="preserve"> indications: </w:t>
+              <w:t xml:space="preserve">Visual indications: </w:t>
             </w:r>
             <w:r>
               <w:rPr>
@@ -2739,21 +2489,7 @@
                 <w:b/>
                 <w:sz w:val="16"/>
               </w:rPr>
-              <w:t xml:space="preserve"> </w:t>
-            </w:r>
-            <w:r>
-              <w:rPr>
-                <w:b/>
-                <w:sz w:val="16"/>
-              </w:rPr>
-              <w:t>shed pending</w:t>
-            </w:r>
-            <w:r>
-              <w:rPr>
-                <w:b/>
-                <w:sz w:val="16"/>
-              </w:rPr>
-              <w:t xml:space="preserve"> / </w:t>
+              <w:t xml:space="preserve"> shed pending / </w:t>
             </w:r>
             <w:r>
               <w:rPr>
@@ -2768,21 +2504,7 @@
                 <w:b/>
                 <w:sz w:val="16"/>
               </w:rPr>
-              <w:t xml:space="preserve"> </w:t>
-            </w:r>
-            <w:r>
-              <w:rPr>
-                <w:b/>
-                <w:sz w:val="16"/>
-              </w:rPr>
-              <w:t>cracks</w:t>
-            </w:r>
-            <w:r>
-              <w:rPr>
-                <w:b/>
-                <w:sz w:val="16"/>
-              </w:rPr>
-              <w:t xml:space="preserve"> / </w:t>
+              <w:t xml:space="preserve"> cracks / </w:t>
             </w:r>
             <w:r>
               <w:rPr>
@@ -2797,28 +2519,7 @@
                 <w:b/>
                 <w:sz w:val="16"/>
               </w:rPr>
-              <w:t xml:space="preserve"> </w:t>
-            </w:r>
-            <w:r>
-              <w:rPr>
-                <w:b/>
-                <w:sz w:val="16"/>
-              </w:rPr>
-              <w:t>erosion</w:t>
-            </w:r>
-            <w:r>
-              <w:rPr>
-                <w:b/>
-                <w:sz w:val="16"/>
-              </w:rPr>
-              <w:t xml:space="preserve"> </w:t>
-            </w:r>
-            <w:r>
-              <w:rPr>
-                <w:b/>
-                <w:sz w:val="16"/>
-              </w:rPr>
-              <w:t xml:space="preserve">/ </w:t>
+              <w:t xml:space="preserve"> erosion / </w:t>
             </w:r>
             <w:r>
               <w:rPr>
@@ -2833,21 +2534,7 @@
                 <w:b/>
                 <w:sz w:val="16"/>
               </w:rPr>
-              <w:t xml:space="preserve"> </w:t>
-            </w:r>
-            <w:r>
-              <w:rPr>
-                <w:b/>
-                <w:sz w:val="16"/>
-              </w:rPr>
-              <w:t>bird waste</w:t>
-            </w:r>
-            <w:r>
-              <w:rPr>
-                <w:b/>
-                <w:sz w:val="16"/>
-              </w:rPr>
-              <w:t xml:space="preserve"> / </w:t>
+              <w:t xml:space="preserve"> bird waste / </w:t>
             </w:r>
             <w:r>
               <w:rPr>
@@ -2862,28 +2549,7 @@
                 <w:b/>
                 <w:sz w:val="16"/>
               </w:rPr>
-              <w:t xml:space="preserve"> </w:t>
-            </w:r>
-            <w:r>
-              <w:rPr>
-                <w:b/>
-                <w:sz w:val="16"/>
-              </w:rPr>
-              <w:t>foreign</w:t>
-            </w:r>
-            <w:r>
-              <w:rPr>
-                <w:b/>
-                <w:sz w:val="16"/>
-              </w:rPr>
-              <w:t xml:space="preserve"> mater</w:t>
-            </w:r>
-            <w:r>
-              <w:rPr>
-                <w:b/>
-                <w:sz w:val="16"/>
-              </w:rPr>
-              <w:t>ial</w:t>
+              <w:t xml:space="preserve"> foreign material</w:t>
             </w:r>
           </w:p>
           <w:p>
@@ -2898,14 +2564,7 @@
                 <w:b/>
                 <w:sz w:val="16"/>
               </w:rPr>
-              <w:t>Any other remark</w:t>
-            </w:r>
-            <w:r>
-              <w:rPr>
-                <w:b/>
-                <w:sz w:val="16"/>
-              </w:rPr>
-              <w:t xml:space="preserve">: </w:t>
+              <w:t xml:space="preserve">Any other remark: </w:t>
             </w:r>
             <w:r>
               <w:t>{{ f.remark }}</w:t>
@@ -2969,14 +2628,7 @@
           <w:b/>
           <w:sz w:val="26"/>
         </w:rPr>
-        <w:t>5</w:t>
-      </w:r>
-      <w:r>
-        <w:rPr>
-          <w:b/>
-          <w:sz w:val="26"/>
-        </w:rPr>
-        <w:t>. Thermal Inspection Measurements</w:t>
+        <w:t>5. Thermal Inspection Measurements</w:t>
       </w:r>
     </w:p>
     <w:tbl>
@@ -2991,6 +2643,7 @@
         <w:gridCol w:w="1277"/>
         <w:gridCol w:w="1277"/>
         <w:gridCol w:w="1276"/>
+        <w:gridCol w:w="1100"/>
         <w:gridCol w:w="1277"/>
         <w:gridCol w:w="1277"/>
         <w:gridCol w:w="1277"/>
@@ -3024,14 +2677,7 @@
                 <w:b/>
                 <w:sz w:val="16"/>
               </w:rPr>
-              <w:t xml:space="preserve">Location </w:t>
-            </w:r>
-            <w:r>
-              <w:rPr>
-                <w:b/>
-                <w:sz w:val="16"/>
-              </w:rPr>
-              <w:t>(Tower No)</w:t>
+              <w:t xml:space="preserve">Location (Tower No)</w:t>
             </w:r>
           </w:p>
         </w:tc>
@@ -3080,6 +2726,25 @@
                 <w:sz w:val="16"/>
               </w:rPr>
               <w:t>ΔT (°C)</w:t>
+            </w:r>
+          </w:p>
+        </w:tc>
+        <w:tc>
+          <w:tcPr>
+            <w:tcW w:w="1100" w:type="dxa"/>
+            <w:shd w:val="clear" w:color="auto" w:fill="B4C6E7"/>
+            <w:vAlign w:val="center"/>
+          </w:tcPr>
+          <w:p>
+            <w:pPr>
+              <w:jc w:val="center"/>
+            </w:pPr>
+            <w:r>
+              <w:rPr>
+                <w:b/>
+                <w:sz w:val="16"/>
+              </w:rPr>
+              <w:t>Severity</w:t>
             </w:r>
           </w:p>
         </w:tc>
@@ -3168,6 +2833,13 @@
         <w:tc>
           <w:tcPr>
             <w:tcW w:w="1278" w:type="dxa"/>
+            <w:vAlign w:val="center"/>
+          </w:tcPr>
+          <w:p/>
+        </w:tc>
+        <w:tc>
+          <w:tcPr>
+            <w:tcW w:w="1100" w:type="dxa"/>
             <w:vAlign w:val="center"/>
           </w:tcPr>
           <w:p/>
@@ -3255,6 +2927,26 @@
         </w:tc>
         <w:tc>
           <w:tcPr>
+            <w:tcW w:w="1100" w:type="dxa"/>
+            <w:shd w:val="clear" w:color="auto" w:fill="{{ m.severity_fill }}"/>
+            <w:vAlign w:val="center"/>
+          </w:tcPr>
+          <w:p>
+            <w:pPr>
+              <w:jc w:val="center"/>
+            </w:pPr>
+            <w:r>
+              <w:rPr>
+                <w:b/>
+                <w:color w:val="{{ m.severity_text_color }}"/>
+                <w:sz w:val="16"/>
+              </w:rPr>
+              <w:t>{{ m.severity_label }}</w:t>
+            </w:r>
+          </w:p>
+        </w:tc>
+        <w:tc>
+          <w:tcPr>
             <w:tcW w:w="1278" w:type="dxa"/>
             <w:vAlign w:val="center"/>
           </w:tcPr>
@@ -3323,6 +3015,13 @@
         <w:tc>
           <w:tcPr>
             <w:tcW w:w="1278" w:type="dxa"/>
+            <w:vAlign w:val="center"/>
+          </w:tcPr>
+          <w:p/>
+        </w:tc>
+        <w:tc>
+          <w:tcPr>
+            <w:tcW w:w="1100" w:type="dxa"/>
             <w:vAlign w:val="center"/>
           </w:tcPr>
           <w:p/>
@@ -3364,14 +3063,7 @@
           <w:b/>
           <w:sz w:val="26"/>
         </w:rPr>
-        <w:t>6</w:t>
-      </w:r>
-      <w:r>
-        <w:rPr>
-          <w:b/>
-          <w:sz w:val="26"/>
-        </w:rPr>
-        <w:t>. Overall Assessment</w:t>
+        <w:t>6. Overall Assessment</w:t>
       </w:r>
     </w:p>
     <w:tbl>
@@ -3568,14 +3260,7 @@
           <w:b/>
           <w:sz w:val="26"/>
         </w:rPr>
-        <w:t>7</w:t>
-      </w:r>
-      <w:r>
-        <w:rPr>
-          <w:b/>
-          <w:sz w:val="26"/>
-        </w:rPr>
-        <w:t>. Approval</w:t>
+        <w:t>7. Approval</w:t>
       </w:r>
     </w:p>
     <w:tbl>

</xml_diff>

<commit_message>
Remove the duplicate Severity column and default insulator type to Composite
The Thermal Inspection Measurements table had two "Severity" columns
after the color-coded one was added — the old plain-text one, now
redundant, is removed. Every insulator on this line is composite, so
the "Insulator Type" checkbox in Inspection findings now defaults to
Composite whenever a position never had that optional field set by
hand, instead of leaving both boxes unticked; an inspector who
explicitly records Porcelain still overrides it, same convention as
_derived_tower_proximity.

Co-Authored-By: Claude Sonnet 5 <noreply@anthropic.com>
</commit_message>
<xml_diff>
--- a/backend/app/templates/oetc_line_report.docx
+++ b/backend/app/templates/oetc_line_report.docx
@@ -2646,7 +2646,6 @@
         <w:gridCol w:w="1100"/>
         <w:gridCol w:w="1277"/>
         <w:gridCol w:w="1277"/>
-        <w:gridCol w:w="1277"/>
       </w:tblGrid>
       <w:tr>
         <w:tc>
@@ -2761,22 +2760,6 @@
                 <w:sz w:val="16"/>
               </w:rPr>
               <w:t>Load / Current</w:t>
-            </w:r>
-          </w:p>
-        </w:tc>
-        <w:tc>
-          <w:tcPr>
-            <w:tcW w:w="1278" w:type="dxa"/>
-            <w:shd w:val="clear" w:color="auto" w:fill="B4C6E7"/>
-            <w:vAlign w:val="center"/>
-          </w:tcPr>
-          <w:p>
-            <w:r>
-              <w:rPr>
-                <w:b/>
-                <w:sz w:val="16"/>
-              </w:rPr>
-              <w:t>Severity</w:t>
             </w:r>
           </w:p>
         </w:tc>
@@ -2858,13 +2841,6 @@
           </w:tcPr>
           <w:p/>
         </w:tc>
-        <w:tc>
-          <w:tcPr>
-            <w:tcW w:w="1278" w:type="dxa"/>
-            <w:vAlign w:val="center"/>
-          </w:tcPr>
-          <w:p/>
-        </w:tc>
       </w:tr>
       <w:tr>
         <w:tc>
@@ -2953,17 +2929,6 @@
           <w:p>
             <w:r>
               <w:t>{{ m.load_current }}</w:t>
-            </w:r>
-          </w:p>
-        </w:tc>
-        <w:tc>
-          <w:tcPr>
-            <w:tcW w:w="1278" w:type="dxa"/>
-            <w:vAlign w:val="center"/>
-          </w:tcPr>
-          <w:p>
-            <w:r>
-              <w:t>{{ m.severity }}</w:t>
             </w:r>
           </w:p>
         </w:tc>
@@ -3022,13 +2987,6 @@
         <w:tc>
           <w:tcPr>
             <w:tcW w:w="1100" w:type="dxa"/>
-            <w:vAlign w:val="center"/>
-          </w:tcPr>
-          <w:p/>
-        </w:tc>
-        <w:tc>
-          <w:tcPr>
-            <w:tcW w:w="1278" w:type="dxa"/>
             <w:vAlign w:val="center"/>
           </w:tcPr>
           <w:p/>

</xml_diff>